<commit_message>
Update lab02 report with detailed descriptions of challenges and decision-making processes
</commit_message>
<xml_diff>
--- a/lab02/relatorio/Relatorio_Laboratorio_Lab02.docx
+++ b/lab02/relatorio/Relatorio_Laboratorio_Lab02.docx
@@ -382,7 +382,7 @@
         <w:rPr>
           <w:lang w:val="pt-BR"/>
         </w:rPr>
-        <w:t xml:space="preserve">Ferramentas de IA generativa tornaram-se onipresentes no desenvolvimento de software, no entanto, ainda há pouca evidência controlada e reprodutível sobre seu real impacto em produtividade e qualidade (a maior parte do que se avalia baseia-se em evidência anedótica). Este laboratório investiga quantitativamente os efeitos do uso de um assistente de IA na resolução de tarefas de programação, através do acompanhamento de métricas de tempo, sucesso e manutenibilidade estrutural.</w:t>
+        <w:t xml:space="preserve">Ferramentas de IA generativa tornaram-se onipresentes no desenvolvimento de software, no entanto, ainda há pouca evidência controlada e reproduzível sobre seu real impacto em produtividade e qualidade (a maior parte do que se avalia baseia-se em evidência anedótica). Este laboratório investiga quantitativamente os efeitos do uso de um assistente de IA na resolução de tarefas de programação, através do acompanhamento de métricas de tempo, sucesso e manutenibilidade estrutural.</w:t>
       </w:r>
     </w:p>
     <w:p>
@@ -538,7 +538,7 @@
         <w:rPr>
           <w:lang w:val="pt-BR"/>
         </w:rPr>
-        <w:t xml:space="preserve">Inovação proposta (30%): Além das métricas fundamentais exigidas (Tempo, Taxa de Sucesso, Complexidade e Duplicação), propomos a aferíção do Índice de Manutenibilidade (MI – Maintainability Index) como métrica composta adicional para a RQ3.</w:t>
+        <w:t xml:space="preserve">Inovação proposta (30%): Além das métricas fundamentais exigidas (Tempo, Taxa de Sucesso, Complexidade e Duplicação), propomos a aferição do Índice de Manutenibilidade (MI - Maintainability Index) como métrica composta adicional para a RQ3.</w:t>
       </w:r>
     </w:p>
     <w:p>
@@ -567,7 +567,7 @@
         <w:rPr>
           <w:lang w:val="pt-BR"/>
         </w:rPr>
-        <w:t xml:space="preserve">Este laboratório insere-se na S02 do projeto e consiste na execução controlada de Katas (exercícios de programação de dificuldade padronizada) em Python. A metodologia baseia-se num experimento crossover within-subject contrabalançado (cada membro atua como controle de si mesmo, resolvendo parte dos katas manualmente e parte com auxílio da IA).</w:t>
+        <w:t xml:space="preserve">Este laboratório insere-se na S02 do projeto e consiste na execução controlada de Katas (exercícios de programação de dificuldade padronizada) em Python. A metodologia baseia-se num experimento crossover within-subject contrabalanceado (cada membro atua como controle de si mesmo, resolvendo parte dos katas manualmente e parte com auxílio da IA).</w:t>
       </w:r>
     </w:p>
     <w:p>
@@ -653,7 +653,7 @@
         <w:rPr>
           <w:lang w:val="pt-BR"/>
         </w:rPr>
-        <w:t xml:space="preserve">Tempo Viciado por Extração "One-Shot": Os tempos capturados na abordagem "com IA" foram irrealisticamente baixos (mediana ~41s), pois a interação resumiu-se ao desenvolvedor copiar e colar o problema inteiro para a IA, e em seguida colar a solução one-shot de volta no editor.</w:t>
+        <w:t xml:space="preserve">Tempo Viciado por Extração "One-Shot": Os tempos capturados na abordagem "com IA" foram irrealisticamente baixos (mediana ~41s), pois a interação resumiu-se ao desenvolvedor, pelo terminal (Claude Code), passar o enunciado inteiro do kata ao agente, que gerava a solução one-shot diretamente no arquivo, sem iteração incremental.</w:t>
       </w:r>
     </w:p>
     <w:p>
@@ -1121,7 +1121,7 @@
         <w:rPr>
           <w:lang w:val="pt-BR"/>
         </w:rPr>
-        <w:t xml:space="preserve">IA Generativa: Claude (Anthropic). (Interface e versão utilizadas: [Preencher modelo e interface])</w:t>
+        <w:t xml:space="preserve">IA Generativa: Claude (Anthropic). (Interface: Claude Code, via terminal/CLI. Modelo: [Preencher modelo])</w:t>
       </w:r>
     </w:p>
     <w:p>
@@ -1652,7 +1652,7 @@
         <w:rPr>
           <w:lang w:val="pt-BR"/>
         </w:rPr>
-        <w:t xml:space="preserve">Propôsemos a coleta e a avaliação do MI através do pacote radon mi. O racional baseia-se na insuficiência da métrica de complexidade isolada. Ao injetarmos o Índice de Manutenibilidade, unimos num só número o volume de Halstead, a complexidade ciclomática e o fator LOC. A hipótese central foi avaliar se a resposta one-shot do Claude criaria rotinas mais "complexas" estruturalmente, mas simultaneamente compensadas em um código mais manutenível (MI maior).</w:t>
+        <w:t xml:space="preserve">Propusemos a coleta e a avaliação do MI através do pacote radon mi. O racional baseia-se na insuficiência da métrica de complexidade isolada. Ao injetarmos o Índice de Manutenibilidade, unimos num só número o volume de Halstead, a complexidade ciclomática e o fator LOC. A hipótese central foi avaliar se a resposta one-shot do Claude criaria rotinas mais "complexas" estruturalmente, mas simultaneamente compensadas em um código mais manutenível (MI maior).</w:t>
       </w:r>
     </w:p>
     <w:p>
@@ -1912,7 +1912,7 @@
         <w:rPr>
           <w:lang w:val="pt-BR"/>
         </w:rPr>
-        <w:t xml:space="preserve">Quanto às ameaças à validade, os desvios registrados (#60) foram vitais. O contrabalanceamento incompleto concentrou possíveis benefícios de aprendizagem (Athoosz iterou primeiro duas vezes com IA, depois sem IA, criando fadiga invertida). Além disso, o tempo aferido de 41s na IA configura uma falha de construto: mensuramos não o processo de "desenvolver em dupla com a máquina", e sim a "velocidade de copiar prompts e transferir arquivos". A validade externa permanece restrita a projetos acadêmicos e katas one-shot.</w:t>
+        <w:t xml:space="preserve">Quanto às ameaças à validade, os desvios registrados (#60) foram vitais. O contrabalanceamento incompleto concentrou possíveis benefícios de aprendizagem (Athoosz iterou primeiro duas vezes com IA, depois sem IA, criando fadiga invertida). Além disso, o tempo aferido de 41s na IA configura uma falha de construto: mensuramos não o processo de "desenvolver em dupla com a máquina", e sim a "velocidade de delegar o kata inteiro ao agente no terminal e aguardar a geração do arquivo". A validade externa permanece restrita a projetos acadêmicos e katas one-shot.</w:t>
       </w:r>
     </w:p>
     <w:p>
@@ -1999,7 +1999,7 @@
         <w:rPr>
           <w:lang w:val="pt-BR"/>
         </w:rPr>
-        <w:t xml:space="preserve">Substituir a IA como portal externo (Claude) por um copiloto inline, medindo de forma transparente a velocidade de predição e pair-programming sem a barreira do "copiar-colar" one-shot.</w:t>
+        <w:t xml:space="preserve">Restringir o uso do agente no terminal (Claude Code) a interações incrementais, ou compará-lo a um copiloto inline, medindo de forma transparente a velocidade de predição e pair-programming em vez da delegação one-shot do kata inteiro.</w:t>
       </w:r>
     </w:p>
     <w:p>

</xml_diff>

<commit_message>
feat: update lab02 report with detailed API specifications and performance metrics
</commit_message>
<xml_diff>
--- a/lab02/relatorio/Relatorio_Laboratorio_Lab02.docx
+++ b/lab02/relatorio/Relatorio_Laboratorio_Lab02.docx
@@ -4018,7 +4018,756 @@
         <w:rPr>
           <w:rtl w:val="0"/>
         </w:rPr>
-        <w:t xml:space="preserve">Cada agente recebeu o mesmo enunciado: implementar do zero uma API HTTP de encurtar URLs (5 operações, persistência, concorrência e durabilidade), com stack livre.</w:t>
+        <w:t xml:space="preserve">Cada agente recebeu o mesmo enunciado: implementar do zero uma API HTTP de encurtar URLs. A linguagem, o framework e a persistência eram livres, entre as ferramentas do ambiente (Python, Node.js, Go e Java). A API tinha cinco operações:</w:t>
+      </w:r>
+    </w:p>
+    <w:tbl>
+      <w:tblPr>
+        <w:tblStyle w:val="Table4"/>
+        <w:tblW w:w="9400.0" w:type="dxa"/>
+        <w:jc w:val="left"/>
+        <w:tblInd w:w="-108.0" w:type="dxa"/>
+        <w:tblBorders>
+          <w:top w:color="000000" w:space="0" w:sz="4" w:val="single"/>
+          <w:left w:color="000000" w:space="0" w:sz="4" w:val="single"/>
+          <w:bottom w:color="000000" w:space="0" w:sz="4" w:val="single"/>
+          <w:right w:color="000000" w:space="0" w:sz="4" w:val="single"/>
+          <w:insideH w:color="000000" w:space="0" w:sz="4" w:val="single"/>
+          <w:insideV w:color="000000" w:space="0" w:sz="4" w:val="single"/>
+        </w:tblBorders>
+        <w:tblLayout w:type="fixed"/>
+        <w:tblLook w:val="0400"/>
+      </w:tblPr>
+      <w:tblGrid>
+        <w:gridCol w:w="2700"/>
+        <w:gridCol w:w="4400"/>
+        <w:gridCol w:w="2300"/>
+        <w:tblGridChange w:id="0">
+          <w:tblGrid>
+            <w:gridCol w:w="3133"/>
+            <w:gridCol w:w="3133"/>
+            <w:gridCol w:w="3134"/>
+          </w:tblGrid>
+        </w:tblGridChange>
+      </w:tblGrid>
+      <w:tr>
+        <w:trPr>
+          <w:cantSplit w:val="0"/>
+          <w:tblHeader w:val="0"/>
+        </w:trPr>
+        <w:tc>
+          <w:tcPr>
+            <w:shd w:fill="1f6e63" w:val="clear"/>
+          </w:tcPr>
+          <w:p>
+            <w:pPr>
+              <w:rPr/>
+            </w:pPr>
+            <w:r>
+              <w:rPr>
+                <w:b/>
+                <w:color w:val="ffffff"/>
+                <w:sz w:val="20"/>
+                <w:szCs w:val="20"/>
+                <w:rtl w:val="0"/>
+              </w:rPr>
+              <w:t xml:space="preserve">Operação</w:t>
+            </w:r>
+          </w:p>
+        </w:tc>
+        <w:tc>
+          <w:tcPr>
+            <w:shd w:fill="1f6e63" w:val="clear"/>
+          </w:tcPr>
+          <w:p>
+            <w:pPr>
+              <w:rPr/>
+            </w:pPr>
+            <w:r>
+              <w:rPr>
+                <w:b/>
+                <w:color w:val="ffffff"/>
+                <w:sz w:val="20"/>
+                <w:szCs w:val="20"/>
+                <w:rtl w:val="0"/>
+              </w:rPr>
+              <w:t xml:space="preserve">O que faz</w:t>
+            </w:r>
+          </w:p>
+        </w:tc>
+        <w:tc>
+          <w:tcPr>
+            <w:shd w:fill="1f6e63" w:val="clear"/>
+          </w:tcPr>
+          <w:p>
+            <w:pPr>
+              <w:rPr/>
+            </w:pPr>
+            <w:r>
+              <w:rPr>
+                <w:b/>
+                <w:color w:val="ffffff"/>
+                <w:sz w:val="20"/>
+                <w:szCs w:val="20"/>
+                <w:rtl w:val="0"/>
+              </w:rPr>
+              <w:t xml:space="preserve">Sucesso / erros</w:t>
+            </w:r>
+          </w:p>
+        </w:tc>
+      </w:tr>
+      <w:tr>
+        <w:trPr>
+          <w:cantSplit w:val="0"/>
+          <w:tblHeader w:val="0"/>
+        </w:trPr>
+        <w:tc>
+          <w:tcPr/>
+          <w:p>
+            <w:pPr>
+              <w:rPr/>
+            </w:pPr>
+            <w:r>
+              <w:rPr>
+                <w:sz w:val="19"/>
+                <w:szCs w:val="19"/>
+                <w:rtl w:val="0"/>
+              </w:rPr>
+              <w:t xml:space="preserve">GET /health</w:t>
+            </w:r>
+          </w:p>
+        </w:tc>
+        <w:tc>
+          <w:tcPr/>
+          <w:p>
+            <w:pPr>
+              <w:rPr/>
+            </w:pPr>
+            <w:r>
+              <w:rPr>
+                <w:sz w:val="19"/>
+                <w:szCs w:val="19"/>
+                <w:rtl w:val="0"/>
+              </w:rPr>
+              <w:t xml:space="preserve">Indica que o serviço está pronto</w:t>
+            </w:r>
+          </w:p>
+        </w:tc>
+        <w:tc>
+          <w:tcPr/>
+          <w:p>
+            <w:pPr>
+              <w:rPr/>
+            </w:pPr>
+            <w:r>
+              <w:rPr>
+                <w:sz w:val="19"/>
+                <w:szCs w:val="19"/>
+                <w:rtl w:val="0"/>
+              </w:rPr>
+              <w:t xml:space="preserve">200</w:t>
+            </w:r>
+          </w:p>
+        </w:tc>
+      </w:tr>
+      <w:tr>
+        <w:trPr>
+          <w:cantSplit w:val="0"/>
+          <w:tblHeader w:val="0"/>
+        </w:trPr>
+        <w:tc>
+          <w:tcPr/>
+          <w:p>
+            <w:pPr>
+              <w:rPr/>
+            </w:pPr>
+            <w:r>
+              <w:rPr>
+                <w:sz w:val="19"/>
+                <w:szCs w:val="19"/>
+                <w:rtl w:val="0"/>
+              </w:rPr>
+              <w:t xml:space="preserve">POST /api/links</w:t>
+            </w:r>
+          </w:p>
+        </w:tc>
+        <w:tc>
+          <w:tcPr/>
+          <w:p>
+            <w:pPr>
+              <w:rPr/>
+            </w:pPr>
+            <w:r>
+              <w:rPr>
+                <w:sz w:val="19"/>
+                <w:szCs w:val="19"/>
+                <w:rtl w:val="0"/>
+              </w:rPr>
+              <w:t xml:space="preserve">Cria um link curto a partir de uma URL, com alias e expiração opcionais</w:t>
+            </w:r>
+          </w:p>
+        </w:tc>
+        <w:tc>
+          <w:tcPr/>
+          <w:p>
+            <w:pPr>
+              <w:rPr/>
+            </w:pPr>
+            <w:r>
+              <w:rPr>
+                <w:sz w:val="19"/>
+                <w:szCs w:val="19"/>
+                <w:rtl w:val="0"/>
+              </w:rPr>
+              <w:t xml:space="preserve">201 / 400, 409, 422</w:t>
+            </w:r>
+          </w:p>
+        </w:tc>
+      </w:tr>
+      <w:tr>
+        <w:trPr>
+          <w:cantSplit w:val="0"/>
+          <w:tblHeader w:val="0"/>
+        </w:trPr>
+        <w:tc>
+          <w:tcPr/>
+          <w:p>
+            <w:pPr>
+              <w:rPr/>
+            </w:pPr>
+            <w:r>
+              <w:rPr>
+                <w:sz w:val="19"/>
+                <w:szCs w:val="19"/>
+                <w:rtl w:val="0"/>
+              </w:rPr>
+              <w:t xml:space="preserve">GET /{code}</w:t>
+            </w:r>
+          </w:p>
+        </w:tc>
+        <w:tc>
+          <w:tcPr/>
+          <w:p>
+            <w:pPr>
+              <w:rPr/>
+            </w:pPr>
+            <w:r>
+              <w:rPr>
+                <w:sz w:val="19"/>
+                <w:szCs w:val="19"/>
+                <w:rtl w:val="0"/>
+              </w:rPr>
+              <w:t xml:space="preserve">Redireciona para a URL original e conta uma visita</w:t>
+            </w:r>
+          </w:p>
+        </w:tc>
+        <w:tc>
+          <w:tcPr/>
+          <w:p>
+            <w:pPr>
+              <w:rPr/>
+            </w:pPr>
+            <w:r>
+              <w:rPr>
+                <w:sz w:val="19"/>
+                <w:szCs w:val="19"/>
+                <w:rtl w:val="0"/>
+              </w:rPr>
+              <w:t xml:space="preserve">302 / 404, 410</w:t>
+            </w:r>
+          </w:p>
+        </w:tc>
+      </w:tr>
+      <w:tr>
+        <w:trPr>
+          <w:cantSplit w:val="0"/>
+          <w:tblHeader w:val="0"/>
+        </w:trPr>
+        <w:tc>
+          <w:tcPr/>
+          <w:p>
+            <w:pPr>
+              <w:rPr/>
+            </w:pPr>
+            <w:r>
+              <w:rPr>
+                <w:sz w:val="19"/>
+                <w:szCs w:val="19"/>
+                <w:rtl w:val="0"/>
+              </w:rPr>
+              <w:t xml:space="preserve">GET /api/links/{code}</w:t>
+            </w:r>
+          </w:p>
+        </w:tc>
+        <w:tc>
+          <w:tcPr/>
+          <w:p>
+            <w:pPr>
+              <w:rPr/>
+            </w:pPr>
+            <w:r>
+              <w:rPr>
+                <w:sz w:val="19"/>
+                <w:szCs w:val="19"/>
+                <w:rtl w:val="0"/>
+              </w:rPr>
+              <w:t xml:space="preserve">Consulta o link, sem contar visita</w:t>
+            </w:r>
+          </w:p>
+        </w:tc>
+        <w:tc>
+          <w:tcPr/>
+          <w:p>
+            <w:pPr>
+              <w:rPr/>
+            </w:pPr>
+            <w:r>
+              <w:rPr>
+                <w:sz w:val="19"/>
+                <w:szCs w:val="19"/>
+                <w:rtl w:val="0"/>
+              </w:rPr>
+              <w:t xml:space="preserve">200 / 404</w:t>
+            </w:r>
+          </w:p>
+        </w:tc>
+      </w:tr>
+      <w:tr>
+        <w:trPr>
+          <w:cantSplit w:val="0"/>
+          <w:tblHeader w:val="0"/>
+        </w:trPr>
+        <w:tc>
+          <w:tcPr/>
+          <w:p>
+            <w:pPr>
+              <w:rPr/>
+            </w:pPr>
+            <w:r>
+              <w:rPr>
+                <w:sz w:val="19"/>
+                <w:szCs w:val="19"/>
+                <w:rtl w:val="0"/>
+              </w:rPr>
+              <w:t xml:space="preserve">DELETE /api/links/{code}</w:t>
+            </w:r>
+          </w:p>
+        </w:tc>
+        <w:tc>
+          <w:tcPr/>
+          <w:p>
+            <w:pPr>
+              <w:rPr/>
+            </w:pPr>
+            <w:r>
+              <w:rPr>
+                <w:sz w:val="19"/>
+                <w:szCs w:val="19"/>
+                <w:rtl w:val="0"/>
+              </w:rPr>
+              <w:t xml:space="preserve">Exclui o link; o código não pode ser reutilizado</w:t>
+            </w:r>
+          </w:p>
+        </w:tc>
+        <w:tc>
+          <w:tcPr/>
+          <w:p>
+            <w:pPr>
+              <w:rPr/>
+            </w:pPr>
+            <w:r>
+              <w:rPr>
+                <w:sz w:val="19"/>
+                <w:szCs w:val="19"/>
+                <w:rtl w:val="0"/>
+              </w:rPr>
+              <w:t xml:space="preserve">204 / 404</w:t>
+            </w:r>
+          </w:p>
+        </w:tc>
+      </w:tr>
+    </w:tbl>
+    <w:p>
+      <w:pPr>
+        <w:rPr/>
+      </w:pPr>
+      <w:r>
+        <w:rPr>
+          <w:rtl w:val="0"/>
+        </w:rPr>
+      </w:r>
+    </w:p>
+    <w:p>
+      <w:pPr>
+        <w:spacing w:after="200" w:lineRule="auto"/>
+        <w:ind w:left="198" w:firstLine="0"/>
+        <w:rPr/>
+      </w:pPr>
+      <w:r>
+        <w:rPr>
+          <w:rtl w:val="0"/>
+        </w:rPr>
+        <w:t xml:space="preserve">O enunciado também fixava as regras de entrega e de comportamento:</w:t>
+      </w:r>
+    </w:p>
+    <w:p>
+      <w:pPr>
+        <w:keepNext w:val="0"/>
+        <w:keepLines w:val="0"/>
+        <w:pageBreakBefore w:val="0"/>
+        <w:widowControl w:val="1"/>
+        <w:numPr>
+          <w:ilvl w:val="0"/>
+          <w:numId w:val="1"/>
+        </w:numPr>
+        <w:pBdr>
+          <w:top w:space="0" w:sz="0" w:val="nil"/>
+          <w:left w:space="0" w:sz="0" w:val="nil"/>
+          <w:bottom w:space="0" w:sz="0" w:val="nil"/>
+          <w:right w:space="0" w:sz="0" w:val="nil"/>
+          <w:between w:space="0" w:sz="0" w:val="nil"/>
+        </w:pBdr>
+        <w:shd w:fill="auto" w:val="clear"/>
+        <w:spacing w:after="0" w:before="0" w:line="276" w:lineRule="auto"/>
+        <w:ind w:left="360" w:right="0" w:hanging="360"/>
+        <w:jc w:val="left"/>
+        <w:rPr>
+          <w:b w:val="0"/>
+          <w:bCs w:val="0"/>
+          <w:i w:val="0"/>
+          <w:iCs w:val="0"/>
+          <w:smallCaps w:val="0"/>
+          <w:strike w:val="0"/>
+          <w:color w:val="202020"/>
+          <w:sz w:val="22"/>
+          <w:szCs w:val="22"/>
+          <w:u w:val="none"/>
+          <w:shd w:fill="auto" w:val="clear"/>
+          <w:vertAlign w:val="baseline"/>
+        </w:rPr>
+      </w:pPr>
+      <w:r>
+        <w:rPr>
+          <w:rFonts w:ascii="Calibri" w:cs="Calibri" w:eastAsia="Calibri" w:hAnsi="Calibri"/>
+          <w:b/>
+          <w:i w:val="0"/>
+          <w:iCs w:val="0"/>
+          <w:smallCaps w:val="0"/>
+          <w:strike w:val="0"/>
+          <w:color w:val="202020"/>
+          <w:sz w:val="22"/>
+          <w:szCs w:val="22"/>
+          <w:u w:val="none"/>
+          <w:shd w:fill="auto" w:val="clear"/>
+          <w:vertAlign w:val="baseline"/>
+          <w:rtl w:val="0"/>
+        </w:rPr>
+        <w:t xml:space="preserve">Entrega: </w:t>
+      </w:r>
+      <w:r>
+        <w:rPr>
+          <w:rFonts w:ascii="Calibri" w:cs="Calibri" w:eastAsia="Calibri" w:hAnsi="Calibri"/>
+          <w:i w:val="0"/>
+          <w:iCs w:val="0"/>
+          <w:smallCaps w:val="0"/>
+          <w:strike w:val="0"/>
+          <w:color w:val="202020"/>
+          <w:sz w:val="22"/>
+          <w:szCs w:val="22"/>
+          <w:u w:val="none"/>
+          <w:shd w:fill="auto" w:val="clear"/>
+          <w:vertAlign w:val="baseline"/>
+          <w:rtl w:val="0"/>
+        </w:rPr>
+        <w:t xml:space="preserve">um build.sh e um start.sh, que o avaliador executa num container novo, sem rede externa, com o servidor na porta 8080.</w:t>
+      </w:r>
+    </w:p>
+    <w:p>
+      <w:pPr>
+        <w:keepNext w:val="0"/>
+        <w:keepLines w:val="0"/>
+        <w:pageBreakBefore w:val="0"/>
+        <w:widowControl w:val="1"/>
+        <w:numPr>
+          <w:ilvl w:val="0"/>
+          <w:numId w:val="1"/>
+        </w:numPr>
+        <w:pBdr>
+          <w:top w:space="0" w:sz="0" w:val="nil"/>
+          <w:left w:space="0" w:sz="0" w:val="nil"/>
+          <w:bottom w:space="0" w:sz="0" w:val="nil"/>
+          <w:right w:space="0" w:sz="0" w:val="nil"/>
+          <w:between w:space="0" w:sz="0" w:val="nil"/>
+        </w:pBdr>
+        <w:shd w:fill="auto" w:val="clear"/>
+        <w:spacing w:after="0" w:before="0" w:line="276" w:lineRule="auto"/>
+        <w:ind w:left="360" w:right="0" w:hanging="360"/>
+        <w:jc w:val="left"/>
+        <w:rPr>
+          <w:b w:val="0"/>
+          <w:bCs w:val="0"/>
+          <w:i w:val="0"/>
+          <w:iCs w:val="0"/>
+          <w:smallCaps w:val="0"/>
+          <w:strike w:val="0"/>
+          <w:color w:val="202020"/>
+          <w:sz w:val="22"/>
+          <w:szCs w:val="22"/>
+          <w:u w:val="none"/>
+          <w:shd w:fill="auto" w:val="clear"/>
+          <w:vertAlign w:val="baseline"/>
+        </w:rPr>
+      </w:pPr>
+      <w:r>
+        <w:rPr>
+          <w:rFonts w:ascii="Calibri" w:cs="Calibri" w:eastAsia="Calibri" w:hAnsi="Calibri"/>
+          <w:b/>
+          <w:i w:val="0"/>
+          <w:iCs w:val="0"/>
+          <w:smallCaps w:val="0"/>
+          <w:strike w:val="0"/>
+          <w:color w:val="202020"/>
+          <w:sz w:val="22"/>
+          <w:szCs w:val="22"/>
+          <w:u w:val="none"/>
+          <w:shd w:fill="auto" w:val="clear"/>
+          <w:vertAlign w:val="baseline"/>
+          <w:rtl w:val="0"/>
+        </w:rPr>
+        <w:t xml:space="preserve">Persistência: </w:t>
+      </w:r>
+      <w:r>
+        <w:rPr>
+          <w:rFonts w:ascii="Calibri" w:cs="Calibri" w:eastAsia="Calibri" w:hAnsi="Calibri"/>
+          <w:i w:val="0"/>
+          <w:iCs w:val="0"/>
+          <w:smallCaps w:val="0"/>
+          <w:strike w:val="0"/>
+          <w:color w:val="202020"/>
+          <w:sz w:val="22"/>
+          <w:szCs w:val="22"/>
+          <w:u w:val="none"/>
+          <w:shd w:fill="auto" w:val="clear"/>
+          <w:vertAlign w:val="baseline"/>
+          <w:rtl w:val="0"/>
+        </w:rPr>
+        <w:t xml:space="preserve">somente no diretório DATA_DIR, sem serviços externos; banco embutido ou arquivos são permitidos.</w:t>
+      </w:r>
+    </w:p>
+    <w:p>
+      <w:pPr>
+        <w:keepNext w:val="0"/>
+        <w:keepLines w:val="0"/>
+        <w:pageBreakBefore w:val="0"/>
+        <w:widowControl w:val="1"/>
+        <w:numPr>
+          <w:ilvl w:val="0"/>
+          <w:numId w:val="1"/>
+        </w:numPr>
+        <w:pBdr>
+          <w:top w:space="0" w:sz="0" w:val="nil"/>
+          <w:left w:space="0" w:sz="0" w:val="nil"/>
+          <w:bottom w:space="0" w:sz="0" w:val="nil"/>
+          <w:right w:space="0" w:sz="0" w:val="nil"/>
+          <w:between w:space="0" w:sz="0" w:val="nil"/>
+        </w:pBdr>
+        <w:shd w:fill="auto" w:val="clear"/>
+        <w:spacing w:after="0" w:before="0" w:line="276" w:lineRule="auto"/>
+        <w:ind w:left="360" w:right="0" w:hanging="360"/>
+        <w:jc w:val="left"/>
+        <w:rPr>
+          <w:b w:val="0"/>
+          <w:bCs w:val="0"/>
+          <w:i w:val="0"/>
+          <w:iCs w:val="0"/>
+          <w:smallCaps w:val="0"/>
+          <w:strike w:val="0"/>
+          <w:color w:val="202020"/>
+          <w:sz w:val="22"/>
+          <w:szCs w:val="22"/>
+          <w:u w:val="none"/>
+          <w:shd w:fill="auto" w:val="clear"/>
+          <w:vertAlign w:val="baseline"/>
+        </w:rPr>
+      </w:pPr>
+      <w:r>
+        <w:rPr>
+          <w:rFonts w:ascii="Calibri" w:cs="Calibri" w:eastAsia="Calibri" w:hAnsi="Calibri"/>
+          <w:b/>
+          <w:i w:val="0"/>
+          <w:iCs w:val="0"/>
+          <w:smallCaps w:val="0"/>
+          <w:strike w:val="0"/>
+          <w:color w:val="202020"/>
+          <w:sz w:val="22"/>
+          <w:szCs w:val="22"/>
+          <w:u w:val="none"/>
+          <w:shd w:fill="auto" w:val="clear"/>
+          <w:vertAlign w:val="baseline"/>
+          <w:rtl w:val="0"/>
+        </w:rPr>
+        <w:t xml:space="preserve">Validação: </w:t>
+      </w:r>
+      <w:r>
+        <w:rPr>
+          <w:rFonts w:ascii="Calibri" w:cs="Calibri" w:eastAsia="Calibri" w:hAnsi="Calibri"/>
+          <w:i w:val="0"/>
+          <w:iCs w:val="0"/>
+          <w:smallCaps w:val="0"/>
+          <w:strike w:val="0"/>
+          <w:color w:val="202020"/>
+          <w:sz w:val="22"/>
+          <w:szCs w:val="22"/>
+          <w:u w:val="none"/>
+          <w:shd w:fill="auto" w:val="clear"/>
+          <w:vertAlign w:val="baseline"/>
+          <w:rtl w:val="0"/>
+        </w:rPr>
+        <w:t xml:space="preserve">URL absoluta http ou https de até 2048 caracteres, alias de 3 a 32 caracteres, expiração no futuro e erros em JSON com código padronizado.</w:t>
+      </w:r>
+    </w:p>
+    <w:p>
+      <w:pPr>
+        <w:keepNext w:val="0"/>
+        <w:keepLines w:val="0"/>
+        <w:pageBreakBefore w:val="0"/>
+        <w:widowControl w:val="1"/>
+        <w:numPr>
+          <w:ilvl w:val="0"/>
+          <w:numId w:val="1"/>
+        </w:numPr>
+        <w:pBdr>
+          <w:top w:space="0" w:sz="0" w:val="nil"/>
+          <w:left w:space="0" w:sz="0" w:val="nil"/>
+          <w:bottom w:space="0" w:sz="0" w:val="nil"/>
+          <w:right w:space="0" w:sz="0" w:val="nil"/>
+          <w:between w:space="0" w:sz="0" w:val="nil"/>
+        </w:pBdr>
+        <w:shd w:fill="auto" w:val="clear"/>
+        <w:spacing w:after="0" w:before="0" w:line="276" w:lineRule="auto"/>
+        <w:ind w:left="360" w:right="0" w:hanging="360"/>
+        <w:jc w:val="left"/>
+        <w:rPr>
+          <w:b w:val="0"/>
+          <w:bCs w:val="0"/>
+          <w:i w:val="0"/>
+          <w:iCs w:val="0"/>
+          <w:smallCaps w:val="0"/>
+          <w:strike w:val="0"/>
+          <w:color w:val="202020"/>
+          <w:sz w:val="22"/>
+          <w:szCs w:val="22"/>
+          <w:u w:val="none"/>
+          <w:shd w:fill="auto" w:val="clear"/>
+          <w:vertAlign w:val="baseline"/>
+        </w:rPr>
+      </w:pPr>
+      <w:r>
+        <w:rPr>
+          <w:rFonts w:ascii="Calibri" w:cs="Calibri" w:eastAsia="Calibri" w:hAnsi="Calibri"/>
+          <w:b/>
+          <w:i w:val="0"/>
+          <w:iCs w:val="0"/>
+          <w:smallCaps w:val="0"/>
+          <w:strike w:val="0"/>
+          <w:color w:val="202020"/>
+          <w:sz w:val="22"/>
+          <w:szCs w:val="22"/>
+          <w:u w:val="none"/>
+          <w:shd w:fill="auto" w:val="clear"/>
+          <w:vertAlign w:val="baseline"/>
+          <w:rtl w:val="0"/>
+        </w:rPr>
+        <w:t xml:space="preserve">Concorrência e durabilidade: </w:t>
+      </w:r>
+      <w:r>
+        <w:rPr>
+          <w:rFonts w:ascii="Calibri" w:cs="Calibri" w:eastAsia="Calibri" w:hAnsi="Calibri"/>
+          <w:i w:val="0"/>
+          <w:iCs w:val="0"/>
+          <w:smallCaps w:val="0"/>
+          <w:strike w:val="0"/>
+          <w:color w:val="202020"/>
+          <w:sz w:val="22"/>
+          <w:szCs w:val="22"/>
+          <w:u w:val="none"/>
+          <w:shd w:fill="auto" w:val="clear"/>
+          <w:vertAlign w:val="baseline"/>
+          <w:rtl w:val="0"/>
+        </w:rPr>
+        <w:t xml:space="preserve">requisições simultâneas não podem perder visitas nem repetir códigos ou aliases, e tudo o que foi confirmado deve sobreviver a um encerramento (SIGTERM) e reinício.</w:t>
+      </w:r>
+    </w:p>
+    <w:p>
+      <w:pPr>
+        <w:keepNext w:val="0"/>
+        <w:keepLines w:val="0"/>
+        <w:pageBreakBefore w:val="0"/>
+        <w:widowControl w:val="1"/>
+        <w:numPr>
+          <w:ilvl w:val="0"/>
+          <w:numId w:val="1"/>
+        </w:numPr>
+        <w:pBdr>
+          <w:top w:space="0" w:sz="0" w:val="nil"/>
+          <w:left w:space="0" w:sz="0" w:val="nil"/>
+          <w:bottom w:space="0" w:sz="0" w:val="nil"/>
+          <w:right w:space="0" w:sz="0" w:val="nil"/>
+          <w:between w:space="0" w:sz="0" w:val="nil"/>
+        </w:pBdr>
+        <w:shd w:fill="auto" w:val="clear"/>
+        <w:spacing w:after="200" w:before="0" w:line="276" w:lineRule="auto"/>
+        <w:ind w:left="360" w:right="0" w:hanging="360"/>
+        <w:jc w:val="left"/>
+        <w:rPr>
+          <w:b w:val="0"/>
+          <w:bCs w:val="0"/>
+          <w:i w:val="0"/>
+          <w:iCs w:val="0"/>
+          <w:smallCaps w:val="0"/>
+          <w:strike w:val="0"/>
+          <w:color w:val="202020"/>
+          <w:sz w:val="22"/>
+          <w:szCs w:val="22"/>
+          <w:u w:val="none"/>
+          <w:shd w:fill="auto" w:val="clear"/>
+          <w:vertAlign w:val="baseline"/>
+        </w:rPr>
+      </w:pPr>
+      <w:r>
+        <w:rPr>
+          <w:rFonts w:ascii="Calibri" w:cs="Calibri" w:eastAsia="Calibri" w:hAnsi="Calibri"/>
+          <w:b/>
+          <w:i w:val="0"/>
+          <w:iCs w:val="0"/>
+          <w:smallCaps w:val="0"/>
+          <w:strike w:val="0"/>
+          <w:color w:val="202020"/>
+          <w:sz w:val="22"/>
+          <w:szCs w:val="22"/>
+          <w:u w:val="none"/>
+          <w:shd w:fill="auto" w:val="clear"/>
+          <w:vertAlign w:val="baseline"/>
+          <w:rtl w:val="0"/>
+        </w:rPr>
+        <w:t xml:space="preserve">Fora do escopo: </w:t>
+      </w:r>
+      <w:r>
+        <w:rPr>
+          <w:rFonts w:ascii="Calibri" w:cs="Calibri" w:eastAsia="Calibri" w:hAnsi="Calibri"/>
+          <w:i w:val="0"/>
+          <w:iCs w:val="0"/>
+          <w:smallCaps w:val="0"/>
+          <w:strike w:val="0"/>
+          <w:color w:val="202020"/>
+          <w:sz w:val="22"/>
+          <w:szCs w:val="22"/>
+          <w:u w:val="none"/>
+          <w:shd w:fill="auto" w:val="clear"/>
+          <w:vertAlign w:val="baseline"/>
+          <w:rtl w:val="0"/>
+        </w:rPr>
+        <w:t xml:space="preserve">autenticação, listagem, edição de links e interface web.</w:t>
       </w:r>
     </w:p>
     <w:tbl>
@@ -4098,7 +4847,7 @@
                 <w:szCs w:val="20"/>
                 <w:rtl w:val="0"/>
               </w:rPr>
-              <w:t xml:space="preserve">Modelo</w:t>
+              <w:t>Modelo · effort</w:t>
             </w:r>
             <w:r>
               <w:rPr>
@@ -4172,7 +4921,7 @@
                 <w:szCs w:val="19"/>
                 <w:rtl w:val="0"/>
               </w:rPr>
-              <w:t xml:space="preserve">claude-opus-5-5</w:t>
+              <w:t>claude-opus-5-5 · high</w:t>
             </w:r>
             <w:r>
               <w:rPr>
@@ -4241,7 +4990,7 @@
                 <w:szCs w:val="19"/>
                 <w:rtl w:val="0"/>
               </w:rPr>
-              <w:t xml:space="preserve">gpt-6-sol</w:t>
+              <w:t>gpt-6-sol · high</w:t>
             </w:r>
             <w:r>
               <w:rPr>
@@ -4310,7 +5059,7 @@
                 <w:szCs w:val="19"/>
                 <w:rtl w:val="0"/>
               </w:rPr>
-              <w:t xml:space="preserve">gpt-6-astra</w:t>
+              <w:t>gpt-6-astra · high</w:t>
             </w:r>
             <w:r>
               <w:rPr>
@@ -4379,7 +5128,7 @@
                 <w:szCs w:val="19"/>
                 <w:rtl w:val="0"/>
               </w:rPr>
-              <w:t xml:space="preserve">muse-spark-1.3</w:t>
+              <w:t>muse-spark-1.3 · xhigh</w:t>
             </w:r>
             <w:r>
               <w:rPr>
@@ -4719,952 +5468,6 @@
           <w:rtl w:val="0"/>
         </w:rPr>
         <w:t xml:space="preserve">6.2 Resultados</w:t>
-      </w:r>
-    </w:p>
-    <w:tbl>
-      <w:tblPr>
-        <w:tblStyle w:val="Table6"/>
-        <w:tblW w:w="9400.0" w:type="dxa"/>
-        <w:jc w:val="left"/>
-        <w:tblInd w:w="-108.0" w:type="dxa"/>
-        <w:tblBorders>
-          <w:top w:color="000000" w:space="0" w:sz="4" w:val="single"/>
-          <w:left w:color="000000" w:space="0" w:sz="4" w:val="single"/>
-          <w:bottom w:color="000000" w:space="0" w:sz="4" w:val="single"/>
-          <w:right w:color="000000" w:space="0" w:sz="4" w:val="single"/>
-          <w:insideH w:color="000000" w:space="0" w:sz="4" w:val="single"/>
-          <w:insideV w:color="000000" w:space="0" w:sz="4" w:val="single"/>
-        </w:tblBorders>
-        <w:tblLayout w:type="fixed"/>
-        <w:tblLook w:val="0400"/>
-      </w:tblPr>
-      <w:tblGrid>
-        <w:gridCol w:w="2600"/>
-        <w:gridCol w:w="1700"/>
-        <w:gridCol w:w="1700"/>
-        <w:gridCol w:w="1700"/>
-        <w:gridCol w:w="1700"/>
-        <w:tblGridChange w:id="0">
-          <w:tblGrid>
-            <w:gridCol w:w="2600"/>
-            <w:gridCol w:w="1700"/>
-            <w:gridCol w:w="1700"/>
-            <w:gridCol w:w="1700"/>
-            <w:gridCol w:w="1700"/>
-          </w:tblGrid>
-        </w:tblGridChange>
-      </w:tblGrid>
-      <w:tr>
-        <w:trPr>
-          <w:cantSplit w:val="0"/>
-          <w:tblHeader w:val="0"/>
-        </w:trPr>
-        <w:tc>
-          <w:tcPr>
-            <w:shd w:fill="1f6e63" w:val="clear"/>
-          </w:tcPr>
-          <w:p>
-            <w:pPr>
-              <w:rPr/>
-            </w:pPr>
-            <w:r>
-              <w:rPr>
-                <w:rtl w:val="0"/>
-              </w:rPr>
-            </w:r>
-          </w:p>
-        </w:tc>
-        <w:tc>
-          <w:tcPr>
-            <w:shd w:fill="1f6e63" w:val="clear"/>
-          </w:tcPr>
-          <w:p>
-            <w:pPr>
-              <w:rPr/>
-            </w:pPr>
-            <w:r>
-              <w:rPr>
-                <w:b w:val="1"/>
-                <w:bCs w:val="1"/>
-                <w:color w:val="ffffff"/>
-                <w:sz w:val="20"/>
-                <w:szCs w:val="20"/>
-                <w:rtl w:val="0"/>
-              </w:rPr>
-              <w:t xml:space="preserve">Opus</w:t>
-            </w:r>
-            <w:r>
-              <w:rPr>
-                <w:rtl w:val="0"/>
-              </w:rPr>
-            </w:r>
-          </w:p>
-        </w:tc>
-        <w:tc>
-          <w:tcPr>
-            <w:shd w:fill="1f6e63" w:val="clear"/>
-          </w:tcPr>
-          <w:p>
-            <w:pPr>
-              <w:rPr/>
-            </w:pPr>
-            <w:r>
-              <w:rPr>
-                <w:b w:val="1"/>
-                <w:bCs w:val="1"/>
-                <w:color w:val="ffffff"/>
-                <w:sz w:val="20"/>
-                <w:szCs w:val="20"/>
-                <w:rtl w:val="0"/>
-              </w:rPr>
-              <w:t xml:space="preserve">Sol</w:t>
-            </w:r>
-            <w:r>
-              <w:rPr>
-                <w:rtl w:val="0"/>
-              </w:rPr>
-            </w:r>
-          </w:p>
-        </w:tc>
-        <w:tc>
-          <w:tcPr>
-            <w:shd w:fill="1f6e63" w:val="clear"/>
-          </w:tcPr>
-          <w:p>
-            <w:pPr>
-              <w:rPr/>
-            </w:pPr>
-            <w:r>
-              <w:rPr>
-                <w:b w:val="1"/>
-                <w:bCs w:val="1"/>
-                <w:color w:val="ffffff"/>
-                <w:sz w:val="20"/>
-                <w:szCs w:val="20"/>
-                <w:rtl w:val="0"/>
-              </w:rPr>
-              <w:t xml:space="preserve">Astra</w:t>
-            </w:r>
-            <w:r>
-              <w:rPr>
-                <w:rtl w:val="0"/>
-              </w:rPr>
-            </w:r>
-          </w:p>
-        </w:tc>
-        <w:tc>
-          <w:tcPr>
-            <w:shd w:fill="1f6e63" w:val="clear"/>
-          </w:tcPr>
-          <w:p>
-            <w:pPr>
-              <w:rPr/>
-            </w:pPr>
-            <w:r>
-              <w:rPr>
-                <w:b w:val="1"/>
-                <w:bCs w:val="1"/>
-                <w:color w:val="ffffff"/>
-                <w:sz w:val="20"/>
-                <w:szCs w:val="20"/>
-                <w:rtl w:val="0"/>
-              </w:rPr>
-              <w:t xml:space="preserve">Muse</w:t>
-            </w:r>
-            <w:r>
-              <w:rPr>
-                <w:rtl w:val="0"/>
-              </w:rPr>
-            </w:r>
-          </w:p>
-        </w:tc>
-      </w:tr>
-      <w:tr>
-        <w:trPr>
-          <w:cantSplit w:val="0"/>
-          <w:tblHeader w:val="0"/>
-        </w:trPr>
-        <w:tc>
-          <w:tcPr/>
-          <w:p>
-            <w:pPr>
-              <w:rPr/>
-            </w:pPr>
-            <w:r>
-              <w:rPr>
-                <w:sz w:val="19"/>
-                <w:szCs w:val="19"/>
-                <w:rtl w:val="0"/>
-              </w:rPr>
-              <w:t xml:space="preserve">Requisitos</w:t>
-            </w:r>
-            <w:r>
-              <w:rPr>
-                <w:rtl w:val="0"/>
-              </w:rPr>
-            </w:r>
-          </w:p>
-        </w:tc>
-        <w:tc>
-          <w:tcPr/>
-          <w:p>
-            <w:pPr>
-              <w:rPr/>
-            </w:pPr>
-            <w:r>
-              <w:rPr>
-                <w:sz w:val="19"/>
-                <w:szCs w:val="19"/>
-                <w:rtl w:val="0"/>
-              </w:rPr>
-              <w:t xml:space="preserve">35/35</w:t>
-            </w:r>
-            <w:r>
-              <w:rPr>
-                <w:rtl w:val="0"/>
-              </w:rPr>
-            </w:r>
-          </w:p>
-        </w:tc>
-        <w:tc>
-          <w:tcPr/>
-          <w:p>
-            <w:pPr>
-              <w:rPr/>
-            </w:pPr>
-            <w:r>
-              <w:rPr>
-                <w:sz w:val="19"/>
-                <w:szCs w:val="19"/>
-                <w:rtl w:val="0"/>
-              </w:rPr>
-              <w:t xml:space="preserve">35/35</w:t>
-            </w:r>
-            <w:r>
-              <w:rPr>
-                <w:rtl w:val="0"/>
-              </w:rPr>
-            </w:r>
-          </w:p>
-        </w:tc>
-        <w:tc>
-          <w:tcPr/>
-          <w:p>
-            <w:pPr>
-              <w:rPr/>
-            </w:pPr>
-            <w:r>
-              <w:rPr>
-                <w:sz w:val="19"/>
-                <w:szCs w:val="19"/>
-                <w:rtl w:val="0"/>
-              </w:rPr>
-              <w:t xml:space="preserve">35/35</w:t>
-            </w:r>
-            <w:r>
-              <w:rPr>
-                <w:rtl w:val="0"/>
-              </w:rPr>
-            </w:r>
-          </w:p>
-        </w:tc>
-        <w:tc>
-          <w:tcPr/>
-          <w:p>
-            <w:pPr>
-              <w:rPr/>
-            </w:pPr>
-            <w:r>
-              <w:rPr>
-                <w:sz w:val="19"/>
-                <w:szCs w:val="19"/>
-                <w:rtl w:val="0"/>
-              </w:rPr>
-              <w:t xml:space="preserve">35/35</w:t>
-            </w:r>
-            <w:r>
-              <w:rPr>
-                <w:rtl w:val="0"/>
-              </w:rPr>
-            </w:r>
-          </w:p>
-        </w:tc>
-      </w:tr>
-      <w:tr>
-        <w:trPr>
-          <w:cantSplit w:val="0"/>
-          <w:tblHeader w:val="0"/>
-        </w:trPr>
-        <w:tc>
-          <w:tcPr/>
-          <w:p>
-            <w:pPr>
-              <w:rPr/>
-            </w:pPr>
-            <w:r>
-              <w:rPr>
-                <w:sz w:val="19"/>
-                <w:szCs w:val="19"/>
-                <w:rtl w:val="0"/>
-              </w:rPr>
-              <w:t xml:space="preserve">Tempo</w:t>
-            </w:r>
-            <w:r>
-              <w:rPr>
-                <w:rtl w:val="0"/>
-              </w:rPr>
-            </w:r>
-          </w:p>
-        </w:tc>
-        <w:tc>
-          <w:tcPr/>
-          <w:p>
-            <w:pPr>
-              <w:rPr/>
-            </w:pPr>
-            <w:r>
-              <w:rPr>
-                <w:sz w:val="19"/>
-                <w:szCs w:val="19"/>
-                <w:rtl w:val="0"/>
-              </w:rPr>
-              <w:t xml:space="preserve">197 s</w:t>
-            </w:r>
-            <w:r>
-              <w:rPr>
-                <w:rtl w:val="0"/>
-              </w:rPr>
-            </w:r>
-          </w:p>
-        </w:tc>
-        <w:tc>
-          <w:tcPr/>
-          <w:p>
-            <w:pPr>
-              <w:rPr/>
-            </w:pPr>
-            <w:r>
-              <w:rPr>
-                <w:sz w:val="19"/>
-                <w:szCs w:val="19"/>
-                <w:rtl w:val="0"/>
-              </w:rPr>
-              <w:t xml:space="preserve">374 s</w:t>
-            </w:r>
-            <w:r>
-              <w:rPr>
-                <w:rtl w:val="0"/>
-              </w:rPr>
-            </w:r>
-          </w:p>
-        </w:tc>
-        <w:tc>
-          <w:tcPr/>
-          <w:p>
-            <w:pPr>
-              <w:rPr/>
-            </w:pPr>
-            <w:r>
-              <w:rPr>
-                <w:sz w:val="19"/>
-                <w:szCs w:val="19"/>
-                <w:rtl w:val="0"/>
-              </w:rPr>
-              <w:t xml:space="preserve">367 s</w:t>
-            </w:r>
-            <w:r>
-              <w:rPr>
-                <w:rtl w:val="0"/>
-              </w:rPr>
-            </w:r>
-          </w:p>
-        </w:tc>
-        <w:tc>
-          <w:tcPr/>
-          <w:p>
-            <w:pPr>
-              <w:rPr/>
-            </w:pPr>
-            <w:r>
-              <w:rPr>
-                <w:sz w:val="19"/>
-                <w:szCs w:val="19"/>
-                <w:rtl w:val="0"/>
-              </w:rPr>
-              <w:t xml:space="preserve">602 s</w:t>
-            </w:r>
-            <w:r>
-              <w:rPr>
-                <w:rtl w:val="0"/>
-              </w:rPr>
-            </w:r>
-          </w:p>
-        </w:tc>
-      </w:tr>
-      <w:tr>
-        <w:trPr>
-          <w:cantSplit w:val="0"/>
-          <w:tblHeader w:val="0"/>
-        </w:trPr>
-        <w:tc>
-          <w:tcPr/>
-          <w:p>
-            <w:pPr>
-              <w:rPr/>
-            </w:pPr>
-            <w:r>
-              <w:rPr>
-                <w:sz w:val="19"/>
-                <w:szCs w:val="19"/>
-                <w:rtl w:val="0"/>
-              </w:rPr>
-              <w:t xml:space="preserve">Chamadas de ferramenta</w:t>
-            </w:r>
-            <w:r>
-              <w:rPr>
-                <w:rtl w:val="0"/>
-              </w:rPr>
-            </w:r>
-          </w:p>
-        </w:tc>
-        <w:tc>
-          <w:tcPr/>
-          <w:p>
-            <w:pPr>
-              <w:rPr/>
-            </w:pPr>
-            <w:r>
-              <w:rPr>
-                <w:sz w:val="19"/>
-                <w:szCs w:val="19"/>
-                <w:rtl w:val="0"/>
-              </w:rPr>
-              <w:t xml:space="preserve">13</w:t>
-            </w:r>
-            <w:r>
-              <w:rPr>
-                <w:rtl w:val="0"/>
-              </w:rPr>
-            </w:r>
-          </w:p>
-        </w:tc>
-        <w:tc>
-          <w:tcPr/>
-          <w:p>
-            <w:pPr>
-              <w:rPr/>
-            </w:pPr>
-            <w:r>
-              <w:rPr>
-                <w:sz w:val="19"/>
-                <w:szCs w:val="19"/>
-                <w:rtl w:val="0"/>
-              </w:rPr>
-              <w:t xml:space="preserve">12</w:t>
-            </w:r>
-            <w:r>
-              <w:rPr>
-                <w:rtl w:val="0"/>
-              </w:rPr>
-            </w:r>
-          </w:p>
-        </w:tc>
-        <w:tc>
-          <w:tcPr/>
-          <w:p>
-            <w:pPr>
-              <w:rPr/>
-            </w:pPr>
-            <w:r>
-              <w:rPr>
-                <w:sz w:val="19"/>
-                <w:szCs w:val="19"/>
-                <w:rtl w:val="0"/>
-              </w:rPr>
-              <w:t xml:space="preserve">10</w:t>
-            </w:r>
-            <w:r>
-              <w:rPr>
-                <w:rtl w:val="0"/>
-              </w:rPr>
-            </w:r>
-          </w:p>
-        </w:tc>
-        <w:tc>
-          <w:tcPr/>
-          <w:p>
-            <w:pPr>
-              <w:rPr/>
-            </w:pPr>
-            <w:r>
-              <w:rPr>
-                <w:sz w:val="19"/>
-                <w:szCs w:val="19"/>
-                <w:rtl w:val="0"/>
-              </w:rPr>
-              <w:t xml:space="preserve">45</w:t>
-            </w:r>
-            <w:r>
-              <w:rPr>
-                <w:rtl w:val="0"/>
-              </w:rPr>
-            </w:r>
-          </w:p>
-        </w:tc>
-      </w:tr>
-      <w:tr>
-        <w:trPr>
-          <w:cantSplit w:val="0"/>
-          <w:tblHeader w:val="0"/>
-        </w:trPr>
-        <w:tc>
-          <w:tcPr/>
-          <w:p>
-            <w:pPr>
-              <w:rPr/>
-            </w:pPr>
-            <w:r>
-              <w:rPr>
-                <w:sz w:val="19"/>
-                <w:szCs w:val="19"/>
-                <w:rtl w:val="0"/>
-              </w:rPr>
-              <w:t xml:space="preserve">Custo estimado</w:t>
-            </w:r>
-            <w:r>
-              <w:rPr>
-                <w:rtl w:val="0"/>
-              </w:rPr>
-            </w:r>
-          </w:p>
-        </w:tc>
-        <w:tc>
-          <w:tcPr/>
-          <w:p>
-            <w:pPr>
-              <w:rPr/>
-            </w:pPr>
-            <w:r>
-              <w:rPr>
-                <w:sz w:val="19"/>
-                <w:szCs w:val="19"/>
-                <w:rtl w:val="0"/>
-              </w:rPr>
-              <w:t xml:space="preserve">US$ 0,65</w:t>
-            </w:r>
-            <w:r>
-              <w:rPr>
-                <w:rtl w:val="0"/>
-              </w:rPr>
-            </w:r>
-          </w:p>
-        </w:tc>
-        <w:tc>
-          <w:tcPr/>
-          <w:p>
-            <w:pPr>
-              <w:rPr/>
-            </w:pPr>
-            <w:r>
-              <w:rPr>
-                <w:sz w:val="19"/>
-                <w:szCs w:val="19"/>
-                <w:rtl w:val="0"/>
-              </w:rPr>
-              <w:t xml:space="preserve">US$ 0,28</w:t>
-            </w:r>
-            <w:r>
-              <w:rPr>
-                <w:rtl w:val="0"/>
-              </w:rPr>
-            </w:r>
-          </w:p>
-        </w:tc>
-        <w:tc>
-          <w:tcPr/>
-          <w:p>
-            <w:pPr>
-              <w:rPr/>
-            </w:pPr>
-            <w:r>
-              <w:rPr>
-                <w:sz w:val="19"/>
-                <w:szCs w:val="19"/>
-                <w:rtl w:val="0"/>
-              </w:rPr>
-              <w:t xml:space="preserve">US$ 0,95</w:t>
-            </w:r>
-            <w:r>
-              <w:rPr>
-                <w:rtl w:val="0"/>
-              </w:rPr>
-            </w:r>
-          </w:p>
-        </w:tc>
-        <w:tc>
-          <w:tcPr/>
-          <w:p>
-            <w:pPr>
-              <w:rPr/>
-            </w:pPr>
-            <w:r>
-              <w:rPr>
-                <w:sz w:val="19"/>
-                <w:szCs w:val="19"/>
-                <w:rtl w:val="0"/>
-              </w:rPr>
-              <w:t xml:space="preserve">US$ 0,63</w:t>
-            </w:r>
-            <w:r>
-              <w:rPr>
-                <w:rtl w:val="0"/>
-              </w:rPr>
-            </w:r>
-          </w:p>
-        </w:tc>
-      </w:tr>
-      <w:tr>
-        <w:trPr>
-          <w:cantSplit w:val="0"/>
-          <w:tblHeader w:val="0"/>
-        </w:trPr>
-        <w:tc>
-          <w:tcPr/>
-          <w:p>
-            <w:pPr>
-              <w:rPr/>
-            </w:pPr>
-            <w:r>
-              <w:rPr>
-                <w:sz w:val="19"/>
-                <w:szCs w:val="19"/>
-                <w:rtl w:val="0"/>
-              </w:rPr>
-              <w:t xml:space="preserve">Stack</w:t>
-            </w:r>
-            <w:r>
-              <w:rPr>
-                <w:rtl w:val="0"/>
-              </w:rPr>
-            </w:r>
-          </w:p>
-        </w:tc>
-        <w:tc>
-          <w:tcPr/>
-          <w:p>
-            <w:pPr>
-              <w:rPr/>
-            </w:pPr>
-            <w:r>
-              <w:rPr>
-                <w:sz w:val="19"/>
-                <w:szCs w:val="19"/>
-                <w:rtl w:val="0"/>
-              </w:rPr>
-              <w:t xml:space="preserve">Go</w:t>
-            </w:r>
-            <w:r>
-              <w:rPr>
-                <w:rtl w:val="0"/>
-              </w:rPr>
-            </w:r>
-          </w:p>
-        </w:tc>
-        <w:tc>
-          <w:tcPr/>
-          <w:p>
-            <w:pPr>
-              <w:rPr/>
-            </w:pPr>
-            <w:r>
-              <w:rPr>
-                <w:sz w:val="19"/>
-                <w:szCs w:val="19"/>
-                <w:rtl w:val="0"/>
-              </w:rPr>
-              <w:t xml:space="preserve">Python + SQLite</w:t>
-            </w:r>
-            <w:r>
-              <w:rPr>
-                <w:rtl w:val="0"/>
-              </w:rPr>
-            </w:r>
-          </w:p>
-        </w:tc>
-        <w:tc>
-          <w:tcPr/>
-          <w:p>
-            <w:pPr>
-              <w:rPr/>
-            </w:pPr>
-            <w:r>
-              <w:rPr>
-                <w:sz w:val="19"/>
-                <w:szCs w:val="19"/>
-                <w:rtl w:val="0"/>
-              </w:rPr>
-              <w:t xml:space="preserve">Python + SQLite</w:t>
-            </w:r>
-            <w:r>
-              <w:rPr>
-                <w:rtl w:val="0"/>
-              </w:rPr>
-            </w:r>
-          </w:p>
-        </w:tc>
-        <w:tc>
-          <w:tcPr/>
-          <w:p>
-            <w:pPr>
-              <w:rPr/>
-            </w:pPr>
-            <w:r>
-              <w:rPr>
-                <w:sz w:val="19"/>
-                <w:szCs w:val="19"/>
-                <w:rtl w:val="0"/>
-              </w:rPr>
-              <w:t xml:space="preserve">Python + SQLite</w:t>
-            </w:r>
-            <w:r>
-              <w:rPr>
-                <w:rtl w:val="0"/>
-              </w:rPr>
-            </w:r>
-          </w:p>
-        </w:tc>
-      </w:tr>
-      <w:tr>
-        <w:trPr>
-          <w:cantSplit w:val="0"/>
-          <w:tblHeader w:val="0"/>
-        </w:trPr>
-        <w:tc>
-          <w:tcPr/>
-          <w:p>
-            <w:pPr>
-              <w:rPr/>
-            </w:pPr>
-            <w:r>
-              <w:rPr>
-                <w:sz w:val="19"/>
-                <w:szCs w:val="19"/>
-                <w:rtl w:val="0"/>
-              </w:rPr>
-              <w:t xml:space="preserve">GET em carga normal (p50)</w:t>
-            </w:r>
-            <w:r>
-              <w:rPr>
-                <w:rtl w:val="0"/>
-              </w:rPr>
-            </w:r>
-          </w:p>
-        </w:tc>
-        <w:tc>
-          <w:tcPr/>
-          <w:p>
-            <w:pPr>
-              <w:rPr/>
-            </w:pPr>
-            <w:r>
-              <w:rPr>
-                <w:sz w:val="19"/>
-                <w:szCs w:val="19"/>
-                <w:rtl w:val="0"/>
-              </w:rPr>
-              <w:t xml:space="preserve">0,04 ms</w:t>
-            </w:r>
-            <w:r>
-              <w:rPr>
-                <w:rtl w:val="0"/>
-              </w:rPr>
-            </w:r>
-          </w:p>
-        </w:tc>
-        <w:tc>
-          <w:tcPr/>
-          <w:p>
-            <w:pPr>
-              <w:rPr/>
-            </w:pPr>
-            <w:r>
-              <w:rPr>
-                <w:sz w:val="19"/>
-                <w:szCs w:val="19"/>
-                <w:rtl w:val="0"/>
-              </w:rPr>
-              <w:t xml:space="preserve">1,32 ms</w:t>
-            </w:r>
-            <w:r>
-              <w:rPr>
-                <w:rtl w:val="0"/>
-              </w:rPr>
-            </w:r>
-          </w:p>
-        </w:tc>
-        <w:tc>
-          <w:tcPr/>
-          <w:p>
-            <w:pPr>
-              <w:rPr/>
-            </w:pPr>
-            <w:r>
-              <w:rPr>
-                <w:sz w:val="19"/>
-                <w:szCs w:val="19"/>
-                <w:rtl w:val="0"/>
-              </w:rPr>
-              <w:t xml:space="preserve">1,51 ms</w:t>
-            </w:r>
-            <w:r>
-              <w:rPr>
-                <w:rtl w:val="0"/>
-              </w:rPr>
-            </w:r>
-          </w:p>
-        </w:tc>
-        <w:tc>
-          <w:tcPr/>
-          <w:p>
-            <w:pPr>
-              <w:rPr/>
-            </w:pPr>
-            <w:r>
-              <w:rPr>
-                <w:sz w:val="19"/>
-                <w:szCs w:val="19"/>
-                <w:rtl w:val="0"/>
-              </w:rPr>
-              <w:t xml:space="preserve">1,50 ms</w:t>
-            </w:r>
-            <w:r>
-              <w:rPr>
-                <w:rtl w:val="0"/>
-              </w:rPr>
-            </w:r>
-          </w:p>
-        </w:tc>
-      </w:tr>
-      <w:tr>
-        <w:trPr>
-          <w:cantSplit w:val="0"/>
-          <w:tblHeader w:val="0"/>
-        </w:trPr>
-        <w:tc>
-          <w:tcPr/>
-          <w:p>
-            <w:pPr>
-              <w:rPr/>
-            </w:pPr>
-            <w:r>
-              <w:rPr>
-                <w:sz w:val="19"/>
-                <w:szCs w:val="19"/>
-                <w:rtl w:val="0"/>
-              </w:rPr>
-              <w:t xml:space="preserve">POST em carga normal (p50)</w:t>
-            </w:r>
-            <w:r>
-              <w:rPr>
-                <w:rtl w:val="0"/>
-              </w:rPr>
-            </w:r>
-          </w:p>
-        </w:tc>
-        <w:tc>
-          <w:tcPr/>
-          <w:p>
-            <w:pPr>
-              <w:rPr/>
-            </w:pPr>
-            <w:r>
-              <w:rPr>
-                <w:sz w:val="19"/>
-                <w:szCs w:val="19"/>
-                <w:rtl w:val="0"/>
-              </w:rPr>
-              <w:t xml:space="preserve">0,05 ms</w:t>
-            </w:r>
-            <w:r>
-              <w:rPr>
-                <w:rtl w:val="0"/>
-              </w:rPr>
-            </w:r>
-          </w:p>
-        </w:tc>
-        <w:tc>
-          <w:tcPr/>
-          <w:p>
-            <w:pPr>
-              <w:rPr/>
-            </w:pPr>
-            <w:r>
-              <w:rPr>
-                <w:sz w:val="19"/>
-                <w:szCs w:val="19"/>
-                <w:rtl w:val="0"/>
-              </w:rPr>
-              <w:t xml:space="preserve">42,3 ms</w:t>
-            </w:r>
-            <w:r>
-              <w:rPr>
-                <w:rtl w:val="0"/>
-              </w:rPr>
-            </w:r>
-          </w:p>
-        </w:tc>
-        <w:tc>
-          <w:tcPr/>
-          <w:p>
-            <w:pPr>
-              <w:rPr/>
-            </w:pPr>
-            <w:r>
-              <w:rPr>
-                <w:sz w:val="19"/>
-                <w:szCs w:val="19"/>
-                <w:rtl w:val="0"/>
-              </w:rPr>
-              <w:t xml:space="preserve">1,62 ms</w:t>
-            </w:r>
-            <w:r>
-              <w:rPr>
-                <w:rtl w:val="0"/>
-              </w:rPr>
-            </w:r>
-          </w:p>
-        </w:tc>
-        <w:tc>
-          <w:tcPr/>
-          <w:p>
-            <w:pPr>
-              <w:rPr/>
-            </w:pPr>
-            <w:r>
-              <w:rPr>
-                <w:sz w:val="19"/>
-                <w:szCs w:val="19"/>
-                <w:rtl w:val="0"/>
-              </w:rPr>
-              <w:t xml:space="preserve">1,57 ms</w:t>
-            </w:r>
-            <w:r>
-              <w:rPr>
-                <w:rtl w:val="0"/>
-              </w:rPr>
-            </w:r>
-          </w:p>
-        </w:tc>
-      </w:tr>
-    </w:tbl>
-    <w:p>
-      <w:pPr>
-        <w:rPr/>
-      </w:pPr>
-      <w:r>
-        <w:rPr>
-          <w:rtl w:val="0"/>
-        </w:rPr>
       </w:r>
     </w:p>
     <w:p>

</xml_diff>